<commit_message>
Adding comments + fixing indentation
</commit_message>
<xml_diff>
--- a/14 & 15 - PBL Checklist.docx
+++ b/14 & 15 - PBL Checklist.docx
@@ -307,6 +307,7 @@
       <w:r>
         <w:rPr>
           <w:rFonts w:ascii="Segoe UI Symbol" w:hAnsi="Segoe UI Symbol" w:cs="Segoe UI Symbol"/>
+          <w:highlight w:val="yellow"/>
         </w:rPr>
         <w:t>☐</w:t>
       </w:r>
@@ -346,6 +347,7 @@
       <w:r>
         <w:rPr>
           <w:rFonts w:ascii="Segoe UI Symbol" w:hAnsi="Segoe UI Symbol" w:cs="Segoe UI Symbol"/>
+          <w:highlight w:val="yellow"/>
         </w:rPr>
         <w:t>☐</w:t>
       </w:r>
@@ -365,6 +367,7 @@
       <w:r>
         <w:rPr>
           <w:rFonts w:ascii="Segoe UI Symbol" w:hAnsi="Segoe UI Symbol" w:cs="Segoe UI Symbol"/>
+          <w:highlight w:val="yellow"/>
         </w:rPr>
         <w:t>☐</w:t>
       </w:r>
@@ -384,6 +387,7 @@
       <w:r>
         <w:rPr>
           <w:rFonts w:ascii="Segoe UI Symbol" w:hAnsi="Segoe UI Symbol" w:cs="Segoe UI Symbol"/>
+          <w:highlight w:val="yellow"/>
         </w:rPr>
         <w:t>☐</w:t>
       </w:r>
@@ -403,6 +407,7 @@
       <w:r>
         <w:rPr>
           <w:rFonts w:ascii="Segoe UI Symbol" w:hAnsi="Segoe UI Symbol" w:cs="Segoe UI Symbol"/>
+          <w:highlight w:val="yellow"/>
         </w:rPr>
         <w:t>☐</w:t>
       </w:r>
@@ -410,7 +415,21 @@
         <w:rPr>
           <w:rFonts w:asciiTheme="majorHAnsi" w:hAnsiTheme="majorHAnsi" w:cstheme="majorHAnsi"/>
         </w:rPr>
-        <w:t xml:space="preserve"> Uses one external library (e.g., #include &lt;DHT.h&gt;) </w:t>
+        <w:t xml:space="preserve"> Uses one external library (e.g., #include &lt;</w:t>
+      </w:r>
+      <w:proofErr w:type="spellStart"/>
+      <w:r>
+        <w:rPr>
+          <w:rFonts w:asciiTheme="majorHAnsi" w:hAnsiTheme="majorHAnsi" w:cstheme="majorHAnsi"/>
+        </w:rPr>
+        <w:t>DHT.h</w:t>
+      </w:r>
+      <w:proofErr w:type="spellEnd"/>
+      <w:r>
+        <w:rPr>
+          <w:rFonts w:asciiTheme="majorHAnsi" w:hAnsiTheme="majorHAnsi" w:cstheme="majorHAnsi"/>
+        </w:rPr>
+        <w:t xml:space="preserve">&gt;) </w:t>
       </w:r>
       <w:r>
         <w:rPr>
@@ -434,6 +453,7 @@
       <w:r>
         <w:rPr>
           <w:rFonts w:ascii="Segoe UI Symbol" w:hAnsi="Segoe UI Symbol" w:cs="Segoe UI Symbol"/>
+          <w:highlight w:val="yellow"/>
         </w:rPr>
         <w:t>☐</w:t>
       </w:r>
@@ -486,7 +506,21 @@
         <w:rPr>
           <w:rFonts w:asciiTheme="majorHAnsi" w:hAnsiTheme="majorHAnsi" w:cstheme="majorHAnsi"/>
         </w:rPr>
-        <w:t xml:space="preserve">Student is able to </w:t>
+        <w:t xml:space="preserve">Student </w:t>
+      </w:r>
+      <w:proofErr w:type="gramStart"/>
+      <w:r>
+        <w:rPr>
+          <w:rFonts w:asciiTheme="majorHAnsi" w:hAnsiTheme="majorHAnsi" w:cstheme="majorHAnsi"/>
+        </w:rPr>
+        <w:t>is able to</w:t>
+      </w:r>
+      <w:proofErr w:type="gramEnd"/>
+      <w:r>
+        <w:rPr>
+          <w:rFonts w:asciiTheme="majorHAnsi" w:hAnsiTheme="majorHAnsi" w:cstheme="majorHAnsi"/>
+        </w:rPr>
+        <w:t xml:space="preserve"> </w:t>
       </w:r>
       <w:r>
         <w:rPr>

</xml_diff>